<commit_message>
CWS listing: mention v3.2.0 visual-testing engines in description
Two prose changes that surface the new audit capabilities without
re-introducing comma-separated keyword lists:

* WHAT IT AUDITS / Live web pages — adds a paragraph describing the
  four new visual-behaviour engines (200% zoom, dark-mode palette
  contrast, colour-only meaning, AAA target size). Written as flowing
  prose, no parenthetical keyword pile-ups, so it stays Yellow-Argon
  safe. Sanity-checked: 0 lines with 4+ short comma-separated tokens.

* Reply-to-rejection-email template — adds a paragraph noting that
  this resubmission also bumps to v3.2.0 with the four new engines,
  cited by SC number rather than by feature-keyword roll-up.

Description body length is now 4,547 paste-ready characters (was
3,872), still ~28% of the 16,000-character CWS limit.

Pair with AMASAMYA-extension-v3.2.0.zip for the next CWS upload.
</commit_message>
<xml_diff>
--- a/beta/cws-listing-description.docx
+++ b/beta/cws-listing-description.docx
@@ -81,6 +81,11 @@
     <w:p>
       <w:r>
         <w:t>Live web pages. Paste a URL or click the toolbar button on any tab. AMASAMYA runs a full WCAG 2.2 audit on the active page covering colour contrast, ARIA validation, focus management, structural semantics, and the broader interaction patterns the standard requires.</w:t>
+      </w:r>
+    </w:p>
+    <w:p>
+      <w:r>
+        <w:t>Beyond the structural checks, AMASAMYA also runs visual-behaviour audits that most other tools skip. It applies a 200% zoom to the page and detects content that clips or introduces horizontal scrolling. It parses any dark-mode stylesheet rules the page declares and verifies the contrast of every colour pair the dark palette specifies. It heuristically flags copy that names a UI element by colour alone, asterisk-only required-field markers with no programmatic indicator, and unlabelled small coloured shapes that look like status dots. It checks every interactive target against the AAA recommendation of forty-four by forty-four CSS pixels in addition to the AA minimum.</w:t>
       </w:r>
     </w:p>
     <w:p>
@@ -854,7 +859,7 @@
         <w:pStyle w:val="IntenseQuote"/>
       </w:pPr>
       <w:r>
-        <w:t>Thank you for the detailed rejection note. I have rewritten the listing description to remove the file-format enumeration that triggered the Yellow Argon keyword-spam flag, and I have proactively removed several other comma-separated keyword lists elsewhere in the description (the WCAG-engine enumeration and the screen-reader brand list) that pattern-match the same policy. The revised description focuses on what AMASAMYA does in plain prose rather than enumerating supported names. The resubmission also includes the corrected runtime icons (the previous build still rendered as "A11Y") and freshly regenerated screenshots. Please review at your convenience.  — Akhilesh Malani</w:t>
+        <w:t>Thank you for the detailed rejection note. I have rewritten the listing description to remove the file-format enumeration that triggered the Yellow Argon keyword-spam flag, and I have proactively removed several other comma-separated keyword lists elsewhere in the description (the WCAG-engine enumeration and the screen-reader brand list) that pattern-match the same policy. The revised description focuses on what AMASAMYA does in plain prose rather than enumerating supported names.  This resubmission also bumps the package to v3.2.0, which adds four new visual-behaviour audit engines: a 200% zoom verification for SC 1.4.4, dark-mode palette contrast verification for SC 1.4.3, a heuristic for colour-only meaning under SC 1.4.1, and the AAA 44 by 44 target-size recommendation under SC 2.5.5. The earlier branding fixes from the previous resubmission (corrected runtime icons that previously still rendered as "A11Y", and freshly regenerated screenshots) are all preserved in this build. Please review at your convenience.  — Akhilesh Malani</w:t>
       </w:r>
     </w:p>
     <w:sectPr>

</xml_diff>